<commit_message>
manuscript revision: four-part abstract, author block, 46 verified references, booktabs tables, sensitivity/hyperparameter tables, privacy-compliant data removal, regenerated submission docs
</commit_message>
<xml_diff>
--- a/manuscript/cover_letter.docx
+++ b/manuscript/cover_letter.docx
@@ -3,20 +3,6 @@
 <w:document xmlns:wpc="http://schemas.microsoft.com/office/word/2010/wordprocessingCanvas" xmlns:mo="http://schemas.microsoft.com/office/mac/office/2008/main" xmlns:mc="http://schemas.openxmlformats.org/markup-compatibility/2006" xmlns:mv="urn:schemas-microsoft-com:mac:vml" xmlns:o="urn:schemas-microsoft-com:office:office" xmlns:r="http://schemas.openxmlformats.org/officeDocument/2006/relationships" xmlns:m="http://schemas.openxmlformats.org/officeDocument/2006/math" xmlns:v="urn:schemas-microsoft-com:vml" xmlns:wp14="http://schemas.microsoft.com/office/word/2010/wordprocessingDrawing" xmlns:wp="http://schemas.openxmlformats.org/drawingml/2006/wordprocessingDrawing" xmlns:w10="urn:schemas-microsoft-com:office:word" xmlns:w="http://schemas.openxmlformats.org/wordprocessingml/2006/main" xmlns:w14="http://schemas.microsoft.com/office/word/2010/wordml" xmlns:wpg="http://schemas.microsoft.com/office/word/2010/wordprocessingGroup" xmlns:wpi="http://schemas.microsoft.com/office/word/2010/wordprocessingInk" xmlns:wne="http://schemas.microsoft.com/office/word/2006/wordml" xmlns:wps="http://schemas.microsoft.com/office/word/2010/wordprocessingShape" mc:Ignorable="w14 wp14">
   <w:body>
     <w:p>
-      <w:pPr>
-        <w:spacing w:after="160"/>
-      </w:pPr>
-      <w:r>
-        <w:rPr>
-          <w:b w:val="0"/>
-        </w:rPr>
-        <w:t>**To the Editors, Computational and Structural Biotechnology Journal**</w:t>
-      </w:r>
-    </w:p>
-    <w:p>
-      <w:pPr>
-        <w:spacing w:after="160"/>
-      </w:pPr>
       <w:r>
         <w:rPr>
           <w:b w:val="0"/>
@@ -25,86 +11,128 @@
       </w:r>
     </w:p>
     <w:p>
-      <w:pPr>
-        <w:spacing w:after="160"/>
-      </w:pPr>
       <w:r>
         <w:rPr>
           <w:b w:val="0"/>
         </w:rPr>
-        <w:t>We are pleased to submit our manuscript, **"Path-AGNN-Cox: a reproducible statistical framework for testing patient-specific pathway rewiring in cancer survival analysis,"** for consideration as a research article in *Computational and Structural Biotechnology Journal*.</w:t>
       </w:r>
     </w:p>
     <w:p>
-      <w:pPr>
-        <w:spacing w:after="160"/>
-      </w:pPr>
       <w:r>
         <w:rPr>
           <w:b w:val="0"/>
         </w:rPr>
-        <w:t>**What the manuscript contributes.** Transcriptomic survival models based on graph neural networks (GNNs) typically treat the underlying gene interaction topology as fixed across patients. A growing line of work organizes genes into KEGG pathway modules before message passing, but the effective graph remains patient-invariant. Our manuscript provides three things:</w:t>
+        <w:t>We are pleased to submit our manuscript, “Path-AGNN-Cox: a reproducible statistical framework for testing patient-specific pathway rewiring in cancer survival analysis”, for consideration.</w:t>
       </w:r>
     </w:p>
     <w:p>
-      <w:pPr>
-        <w:spacing w:after="160"/>
-      </w:pPr>
       <w:r>
         <w:rPr>
           <w:b w:val="0"/>
         </w:rPr>
-        <w:t>1. **A model that produces patient-specific pathway graphs.** Path-AGNN-Cox constrains message passing to KEGG pathway subgraphs and learns per-patient attention edge weights, with a Cox partial-likelihood head and dual regularization. We do not claim that this improves discrimination: benchmarked on 11 TCGA cancer types (5-fold cross-validation) with 25 independent GEO external cohorts, its C-index is comparable to, but not better than, penalized Cox baselines.</w:t>
       </w:r>
     </w:p>
     <w:p>
-      <w:pPr>
-        <w:spacing w:after="160"/>
-      </w:pPr>
+      <w:r>
+        <w:rPr>
+          <w:b/>
+        </w:rPr>
+        <w:t>What the manuscript contributes.</w:t>
+      </w:r>
+    </w:p>
+    <w:p>
       <w:r>
         <w:rPr>
           <w:b w:val="0"/>
         </w:rPr>
-        <w:t>2. **A statistical testing framework for pathway rewiring.** The paper formalizes edge- and pathway-level tests of between-stratum rewiring with BH-FDR control, label-permutation nulls, a static-model negative control, and a standard-GAT architectural control. To our knowledge, this is the first reproducible framework in which sample-specific pathway rewiring is defined operationally and tested formally, rather than reported qualitatively from attention maps.</w:t>
+        <w:t>Transcriptomic survival models based on graph neural networks (GNNs) typically treat the underlying gene interaction topology as fixed and identical across patients. Path-AGNN-Cox constrains message passing to KEGG pathway subgraphs and learns per-patient pathway graphs; we additionally provide a statistical framework for formally testing patient-specific pathway rewiring, with edge- and pathway-level tests under false-discovery-rate control, label-permutation nulls, a static-model negative control, and a standard-GAT architectural control.</w:t>
       </w:r>
     </w:p>
     <w:p>
-      <w:pPr>
-        <w:spacing w:after="160"/>
-      </w:pPr>
       <w:r>
         <w:rPr>
           <w:b w:val="0"/>
         </w:rPr>
-        <w:t>3. **Clinical and external anchoring.** Rewiring magnitude correlates with Ki-67 expression in two independent cohorts (TCGA-BRCA and the IMvigor210 anti-PD-L1 cohort) and with tumor mutational burden in TCGA-LUAD; multivariable Cox models confirm independent association of the risk score with overall survival. We also report the negative results transparently: in six external GEO cohorts, rewiring magnitude was not significantly associated with overall survival, and immunotherapy response differences in IMvigor210 were not significant.</w:t>
       </w:r>
     </w:p>
     <w:p>
-      <w:pPr>
-        <w:spacing w:after="160"/>
-      </w:pPr>
+      <w:r>
+        <w:rPr>
+          <w:b/>
+        </w:rPr>
+        <w:t>Key points.</w:t>
+      </w:r>
+    </w:p>
+    <w:p>
       <w:r>
         <w:rPr>
           <w:b w:val="0"/>
         </w:rPr>
-        <w:t>**Reproducibility.** All code is released as an open-source Python package with a pip-installable distribution, example notebooks, and reproducible pipelines for data download, benchmarking, rewiring testing, and figure generation, available at https://github.com/wangzhipeng-1/Path-AGNN-Cox and on PyPI (https://pypi.org/project/path-agnn-cox/), with an archived snapshot at Zenodo (https://doi.org/10.5281/zenodo.22030045). We believe this satisfies the journal's emphasis on transparent, reproducible methods.</w:t>
+        <w:t>1. A model that produces patient-specific pathway graphs, coupled to a Cox survival objective with dual regularization.</w:t>
       </w:r>
     </w:p>
     <w:p>
-      <w:pPr>
-        <w:spacing w:after="160"/>
-      </w:pPr>
       <w:r>
         <w:rPr>
           <w:b w:val="0"/>
         </w:rPr>
-        <w:t>All authors have read and approved the manuscript, and none of the authors has a competing financial interest. The manuscript is not under consideration elsewhere.</w:t>
+        <w:t>2. A statistical testing framework for pathway rewiring, benchmarked across 11 TCGA cancer types and 25 independent GEO cohorts, with three ablations and multiple controls.</w:t>
       </w:r>
     </w:p>
     <w:p>
-      <w:pPr>
-        <w:spacing w:after="160"/>
-      </w:pPr>
+      <w:r>
+        <w:rPr>
+          <w:b w:val="0"/>
+        </w:rPr>
+        <w:t>3. Clinical and external anchoring: rewiring magnitude correlates with Ki-67 in two independent cohorts and with tumor mutational burden in LUAD, and is absent by construction in static pathway models.</w:t>
+      </w:r>
+    </w:p>
+    <w:p>
+      <w:r>
+        <w:rPr>
+          <w:b w:val="0"/>
+        </w:rPr>
+      </w:r>
+    </w:p>
+    <w:p>
+      <w:r>
+        <w:rPr>
+          <w:b/>
+        </w:rPr>
+        <w:t>Reproducibility.</w:t>
+      </w:r>
+    </w:p>
+    <w:p>
+      <w:r>
+        <w:rPr>
+          <w:b w:val="0"/>
+        </w:rPr>
+        <w:t>All code is released as an open-source Python package with a pip-installable distribution, example notebooks, and reproducible pipelines covering every table and figure. No patient-level data are redistributed; aggregate outputs required for reproduction are provided.</w:t>
+      </w:r>
+    </w:p>
+    <w:p>
+      <w:r>
+        <w:rPr>
+          <w:b w:val="0"/>
+        </w:rPr>
+      </w:r>
+    </w:p>
+    <w:p>
+      <w:r>
+        <w:rPr>
+          <w:b w:val="0"/>
+        </w:rPr>
+        <w:t>All authors have read and approved the manuscript, and none of the authors has a competing interest. This study was approved by the Ethics Committee of Zhongda Hospital Affiliated with Southeast University. The manuscript is not under consideration elsewhere.</w:t>
+      </w:r>
+    </w:p>
+    <w:p>
+      <w:r>
+        <w:rPr>
+          <w:b w:val="0"/>
+        </w:rPr>
+      </w:r>
+    </w:p>
+    <w:p>
       <w:r>
         <w:rPr>
           <w:b w:val="0"/>
@@ -113,9 +141,13 @@
       </w:r>
     </w:p>
     <w:p>
-      <w:pPr>
-        <w:spacing w:after="160"/>
-      </w:pPr>
+      <w:r>
+        <w:rPr>
+          <w:b w:val="0"/>
+        </w:rPr>
+      </w:r>
+    </w:p>
+    <w:p>
       <w:r>
         <w:rPr>
           <w:b w:val="0"/>
@@ -124,25 +156,51 @@
       </w:r>
     </w:p>
     <w:p>
-      <w:pPr>
-        <w:spacing w:after="160"/>
-      </w:pPr>
       <w:r>
         <w:rPr>
           <w:b w:val="0"/>
         </w:rPr>
-        <w:t>[Author names and affiliations]</w:t>
+        <w:t>Zhipeng Wang[1,*], Luning Wang[2,*], Changsong Wang[1,†], Pengli Zhai[3], Zejun Liu[1], Hui Feng[1], Hongmei Liu[1], Qian Hou[1], Ming Guo[1]</w:t>
       </w:r>
     </w:p>
     <w:p>
-      <w:pPr>
-        <w:spacing w:after="160"/>
-      </w:pPr>
       <w:r>
         <w:rPr>
           <w:b w:val="0"/>
         </w:rPr>
-        <w:t>Corresponding author: [name], [email], [address]</w:t>
+        <w:t>1 Department of TCM, Zhongda Hospital, Southeast University, China</w:t>
+      </w:r>
+    </w:p>
+    <w:p>
+      <w:r>
+        <w:rPr>
+          <w:b w:val="0"/>
+        </w:rPr>
+        <w:t>2 Department of Rehabilitation Medicine, Zhongda Hospital, Southeast University, China</w:t>
+      </w:r>
+    </w:p>
+    <w:p>
+      <w:r>
+        <w:rPr>
+          <w:b w:val="0"/>
+        </w:rPr>
+        <w:t>3 Jiangbei Campus, Jiangsu Provincial Traditional Chinese Medicine Hospital, China</w:t>
+      </w:r>
+    </w:p>
+    <w:p>
+      <w:r>
+        <w:rPr>
+          <w:b w:val="0"/>
+        </w:rPr>
+        <w:t>* These authors contributed equally to this work and are co-first authors.</w:t>
+      </w:r>
+    </w:p>
+    <w:p>
+      <w:r>
+        <w:rPr>
+          <w:b w:val="0"/>
+        </w:rPr>
+        <w:t>† Corresponding author: Changsong Wang, Department of TCM, Zhongda Hospital, Southeast University, China. Email: 101005664@seu.edu.cn</w:t>
       </w:r>
     </w:p>
     <w:sectPr>

</xml_diff>

<commit_message>
GSE225066 NEODURVARIB as third BLCA-template cohort: null result (g=0.05, P=1.000, 79.9% random-control percentile); 3-cohort meta g=0.27 (P=0.025, I2=0%) carried by the two RECIST cohorts; manuscript, cover letter (journal name fix to Briefings in Bioinformatics) and plan doc updated
</commit_message>
<xml_diff>
--- a/manuscript/cover_letter.docx
+++ b/manuscript/cover_letter.docx
@@ -32,7 +32,7 @@
         <w:rPr>
           <w:b w:val="0"/>
         </w:rPr>
-        <w:t>We are pleased to submit our manuscript, **"Path-AGNN-Cox: a reproducible statistical framework for testing patient-specific pathway rewiring in cancer survival analysis,"** for consideration as a research article in *Computational and Structural Biotechnology Journal*.</w:t>
+        <w:t>We are pleased to submit our manuscript, **"Path-AGNN-Cox: a reproducible statistical framework for testing patient-specific pathway rewiring in cancer survival analysis,"** for consideration as a research article in *Briefings in Bioinformatics*.</w:t>
       </w:r>
     </w:p>
     <w:p>
@@ -76,7 +76,7 @@
         <w:rPr>
           <w:b w:val="0"/>
         </w:rPr>
-        <w:t>3. **Clinical and external anchoring.** Rewiring magnitude correlates with Ki-67 expression in two independent cohorts (TCGA-BRCA and the IMvigor210 anti-PD-L1 cohort) and with tumor mutational burden in TCGA-LUAD; multivariable Cox models confirm independent association of the risk score with overall survival. We report the negative results transparently: in six external GEO cohorts, rewiring magnitude was not significantly associated with overall survival, and in three melanoma ICB cohorts a prognosis-associated rewiring template did not exceed random gene-set controls. As an exploratory immunotherapy finding, the same template was associated with anti-PD-L1 response in IMvigor210 (Wilcoxon P = 0.019, exceeding 96.2% of random gene-set controls), and this association was concentrated in the low-TMB stratum (P = 0.004; response rate 18.4% vs 6.9%, Fisher exact P = 0.032). The direction was consistent in a second urothelial ICB cohort, GSE176307, with a combined BLCA-template effect of g = 0.28 (95% CI 0.04-0.53, P = 0.022, I2 = 0%).</w:t>
+        <w:t>3. **Clinical and external anchoring.** Rewiring magnitude correlates with Ki-67 expression in two independent cohorts (TCGA-BRCA and the IMvigor210 anti-PD-L1 cohort) and with tumor mutational burden in TCGA-LUAD; multivariable Cox models confirm independent association of the risk score with overall survival. We report the negative results transparently: in six external GEO cohorts, rewiring magnitude was not significantly associated with overall survival, and in three melanoma ICB cohorts a prognosis-associated rewiring template did not exceed random gene-set controls. As an exploratory immunotherapy finding, the same template was associated with anti-PD-L1 response in IMvigor210 (Wilcoxon P = 0.019, exceeding 96.2% of random gene-set controls), and this association was concentrated in the low-TMB stratum (P = 0.004; response rate 18.4% vs 6.9%, Fisher exact P = 0.032). The direction was consistent in a second urothelial ICB cohort, GSE176307, with a combined BLCA-template effect of g = 0.28 (95% CI 0.04-0.53, P = 0.022, I2 = 0%). A third urothelial cohort with a different endpoint, neoadjuvant durvalumab plus olaparib with pathological response in GSE225066 (n = 16 pre-treatment biopsies), showed no association beyond random controls (P = 1.000; random-control percentile 79.9%); the three-cohort combination remained nominally significant (g = 0.27, 95% CI 0.03-0.51, P = 0.025), with the signal carried by the two RECIST-assessed cohorts.</w:t>
       </w:r>
     </w:p>
     <w:p>

</xml_diff>